<commit_message>
docs: update UAT Execution Document with formatted test records
</commit_message>
<xml_diff>
--- a/Documentation/5. Project Development/UAT_Execution_Document.docx
+++ b/Documentation/5. Project Development/UAT_Execution_Document.docx
@@ -1,8 +1,8 @@
 
 <file path=word/document.xml><?xml version="1.0" encoding="utf-8"?>
-<w:document xmlns:ns1="http://schemas.openxmlformats.org/markup-compatibility/2006" xmlns:ns2="http://schemas.microsoft.com/office/word/2010/wordml" xmlns:r="http://schemas.openxmlformats.org/officeDocument/2006/relationships" xmlns:w="http://schemas.openxmlformats.org/wordprocessingml/2006/main" ns1:Ignorable="w14 w15 w16se w16cid w16 w16cex w16sdtdh w16sdtfl w16du wp14">
+<w:document xmlns:wpc="http://schemas.microsoft.com/office/word/2010/wordprocessingCanvas" xmlns:cx="http://schemas.microsoft.com/office/drawing/2014/chartex" xmlns:cx1="http://schemas.microsoft.com/office/drawing/2015/9/8/chartex" xmlns:cx2="http://schemas.microsoft.com/office/drawing/2015/10/21/chartex" xmlns:cx3="http://schemas.microsoft.com/office/drawing/2016/5/9/chartex" xmlns:cx4="http://schemas.microsoft.com/office/drawing/2016/5/10/chartex" xmlns:cx5="http://schemas.microsoft.com/office/drawing/2016/5/11/chartex" xmlns:cx6="http://schemas.microsoft.com/office/drawing/2016/5/12/chartex" xmlns:cx7="http://schemas.microsoft.com/office/drawing/2016/5/13/chartex" xmlns:cx8="http://schemas.microsoft.com/office/drawing/2016/5/14/chartex" xmlns:mc="http://schemas.openxmlformats.org/markup-compatibility/2006" xmlns:aink="http://schemas.microsoft.com/office/drawing/2016/ink" xmlns:am3d="http://schemas.microsoft.com/office/drawing/2017/model3d" xmlns:o="urn:schemas-microsoft-com:office:office" xmlns:oel="http://schemas.microsoft.com/office/2019/extlst" xmlns:r="http://schemas.openxmlformats.org/officeDocument/2006/relationships" xmlns:m="http://schemas.openxmlformats.org/officeDocument/2006/math" xmlns:v="urn:schemas-microsoft-com:vml" xmlns:wp14="http://schemas.microsoft.com/office/word/2010/wordprocessingDrawing" xmlns:wp="http://schemas.openxmlformats.org/drawingml/2006/wordprocessingDrawing" xmlns:w10="urn:schemas-microsoft-com:office:word" xmlns:w="http://schemas.openxmlformats.org/wordprocessingml/2006/main" xmlns:w14="http://schemas.microsoft.com/office/word/2010/wordml" xmlns:w15="http://schemas.microsoft.com/office/word/2012/wordml" xmlns:w16cex="http://schemas.microsoft.com/office/word/2018/wordml/cex" xmlns:w16cid="http://schemas.microsoft.com/office/word/2016/wordml/cid" xmlns:w16="http://schemas.microsoft.com/office/word/2018/wordml" xmlns:w16du="http://schemas.microsoft.com/office/word/2023/wordml/word16du" xmlns:w16sdtdh="http://schemas.microsoft.com/office/word/2020/wordml/sdtdatahash" xmlns:w16sdtfl="http://schemas.microsoft.com/office/word/2024/wordml/sdtformatlock" xmlns:w16se="http://schemas.microsoft.com/office/word/2015/wordml/symex" xmlns:wpg="http://schemas.microsoft.com/office/word/2010/wordprocessingGroup" xmlns:wpi="http://schemas.microsoft.com/office/word/2010/wordprocessingInk" xmlns:wne="http://schemas.microsoft.com/office/word/2006/wordml" xmlns:wps="http://schemas.microsoft.com/office/word/2010/wordprocessingShape" mc:Ignorable="w14 w15 w16se w16cid w16 w16cex w16sdtdh w16sdtfl w16du wp14">
   <w:body>
-    <w:p ns2:paraId="0BC3EC85" ns2:textId="77777777">
+    <w:p>
       <w:pPr>
         <w:spacing w:after="20"/>
         <w:jc w:val="center"/>
@@ -16,7 +16,7 @@
         <w:t>PROJECT DEVELOPMENT</w:t>
       </w:r>
     </w:p>
-    <w:p ns2:paraId="76556E6C" ns2:textId="77777777">
+    <w:p>
       <w:pPr>
         <w:spacing w:after="160"/>
         <w:jc w:val="center"/>
@@ -40,7 +40,7 @@
         <w:gridCol w:w="5323"/>
         <w:gridCol w:w="5323"/>
       </w:tblGrid>
-      <w:tr ns2:paraId="059D3595" ns2:textId="77777777">
+      <w:tr>
         <w:trPr>
           <w:cantSplit/>
           <w:jc w:val="center"/>
@@ -56,7 +56,7 @@
               <w:right w:w="80" w:type="dxa"/>
             </w:tcMar>
           </w:tcPr>
-          <w:p ns2:paraId="467A29B5" ns2:textId="77777777">
+          <w:p>
             <w:r>
               <w:rPr>
                 <w:b/>
@@ -75,14 +75,20 @@
               <w:right w:w="80" w:type="dxa"/>
             </w:tcMar>
           </w:tcPr>
-          <w:p ns2:paraId="579EE3FD" ns2:textId="70C2F49A">
-            <w:r>
-              <w:t>27 October 2026</w:t>
+          <w:p>
+            <w:r>
+              <w:t>2</w:t>
+            </w:r>
+            <w:r>
+              <w:t>1</w:t>
+            </w:r>
+            <w:r>
+              <w:t xml:space="preserve"> October 2026</w:t>
             </w:r>
           </w:p>
         </w:tc>
       </w:tr>
-      <w:tr ns2:paraId="50D3C35C" ns2:textId="77777777">
+      <w:tr>
         <w:trPr>
           <w:cantSplit/>
           <w:jc w:val="center"/>
@@ -98,7 +104,7 @@
               <w:right w:w="80" w:type="dxa"/>
             </w:tcMar>
           </w:tcPr>
-          <w:p ns2:paraId="7B1D5258" ns2:textId="77777777">
+          <w:p>
             <w:r>
               <w:rPr>
                 <w:b/>
@@ -117,14 +123,14 @@
               <w:right w:w="80" w:type="dxa"/>
             </w:tcMar>
           </w:tcPr>
-          <w:p ns2:paraId="2EECE32B" ns2:textId="77777777">
+          <w:p>
             <w:r>
               <w:t>Individual Project</w:t>
             </w:r>
           </w:p>
         </w:tc>
       </w:tr>
-      <w:tr ns2:paraId="5111FA56" ns2:textId="77777777">
+      <w:tr>
         <w:trPr>
           <w:cantSplit/>
           <w:jc w:val="center"/>
@@ -140,7 +146,7 @@
               <w:right w:w="80" w:type="dxa"/>
             </w:tcMar>
           </w:tcPr>
-          <w:p ns2:paraId="66FA78FC" ns2:textId="77777777">
+          <w:p>
             <w:r>
               <w:rPr>
                 <w:b/>
@@ -159,14 +165,14 @@
               <w:right w:w="80" w:type="dxa"/>
             </w:tcMar>
           </w:tcPr>
-          <w:p ns2:paraId="32005036" ns2:textId="56424713">
+          <w:p>
             <w:r>
               <w:t>Online Complaint Registration</w:t>
             </w:r>
           </w:p>
         </w:tc>
       </w:tr>
-      <w:tr ns2:paraId="72C7E79F" ns2:textId="77777777">
+      <w:tr>
         <w:trPr>
           <w:cantSplit/>
           <w:jc w:val="center"/>
@@ -182,7 +188,7 @@
               <w:right w:w="80" w:type="dxa"/>
             </w:tcMar>
           </w:tcPr>
-          <w:p ns2:paraId="39BDA376" ns2:textId="77777777">
+          <w:p>
             <w:r>
               <w:rPr>
                 <w:b/>
@@ -201,7 +207,7 @@
               <w:right w:w="80" w:type="dxa"/>
             </w:tcMar>
           </w:tcPr>
-          <w:p ns2:paraId="3B34C720" ns2:textId="77777777">
+          <w:p>
             <w:r>
               <w:t>v1.0.0 (Production Release / UAT Sign-off)</w:t>
             </w:r>
@@ -209,7 +215,7 @@
         </w:tc>
       </w:tr>
     </w:tbl>
-    <w:p ns2:paraId="7A0DA629" ns2:textId="77777777">
+    <w:p>
       <w:pPr>
         <w:pStyle w:val="Heading1"/>
       </w:pPr>
@@ -217,32 +223,32 @@
         <w:t>1. Project Overview &amp; Testing Environment</w:t>
       </w:r>
     </w:p>
-    <w:p ns2:paraId="78AC6635" ns2:textId="77777777">
+    <w:p>
       <w:r>
         <w:t>Project Description: A MERN-stack web application for registering, assigning, tracking, and resolving complaints. The system supports three roles: Ordinary User, Agent, and Administrator.</w:t>
       </w:r>
     </w:p>
-    <w:p ns2:paraId="08D9EE14" ns2:textId="77777777">
+    <w:p>
       <w:r>
         <w:t>Testing Status: This document is a UAT execution record template. Test cases have not been marked as passed; actual results and pass/fail status must be filled in after running the application.</w:t>
       </w:r>
     </w:p>
-    <w:p ns2:paraId="2B8F1B41" ns2:textId="77777777">
+    <w:p>
       <w:r>
         <w:t>Testing Period: To be recorded when formal testing begins and ends.</w:t>
       </w:r>
     </w:p>
-    <w:p ns2:paraId="2C1569FA" ns2:textId="77777777">
+    <w:p>
       <w:r>
         <w:t>Testing Environment: Local development or staging environment, after frontend, backend, and MongoDB are configured and running.</w:t>
       </w:r>
     </w:p>
-    <w:p ns2:paraId="4C8F5BBC" ns2:textId="77777777">
+    <w:p>
       <w:r>
         <w:t>Test Accounts: Create dedicated test accounts for each role. Do not use real user information or include production credentials in this document.</w:t>
       </w:r>
     </w:p>
-    <w:p ns2:paraId="32BF12D0" ns2:textId="77777777">
+    <w:p>
       <w:pPr>
         <w:pStyle w:val="Heading2"/>
       </w:pPr>
@@ -250,7 +256,7 @@
         <w:t>Testing Scope</w:t>
       </w:r>
     </w:p>
-    <w:p ns2:paraId="67419565" ns2:textId="77777777">
+    <w:p>
       <w:pPr>
         <w:pStyle w:val="ListBullet"/>
         <w:spacing w:after="20"/>
@@ -259,7 +265,7 @@
         <w:t>Registration, login, logout, and role-based access control.</w:t>
       </w:r>
     </w:p>
-    <w:p ns2:paraId="5A0D29BE" ns2:textId="77777777">
+    <w:p>
       <w:pPr>
         <w:pStyle w:val="ListBullet"/>
         <w:spacing w:after="20"/>
@@ -268,7 +274,7 @@
         <w:t>Complaint submission, reference number generation, viewing, and status tracking.</w:t>
       </w:r>
     </w:p>
-    <w:p ns2:paraId="460746FF" ns2:textId="77777777">
+    <w:p>
       <w:pPr>
         <w:pStyle w:val="ListBullet"/>
         <w:spacing w:after="20"/>
@@ -277,7 +283,7 @@
         <w:t>Administrator complaint oversight and assignment to eligible agents.</w:t>
       </w:r>
     </w:p>
-    <w:p ns2:paraId="203B90D6" ns2:textId="77777777">
+    <w:p>
       <w:pPr>
         <w:pStyle w:val="ListBullet"/>
         <w:spacing w:after="20"/>
@@ -286,7 +292,7 @@
         <w:t>Agent access to assigned complaints and permitted status transitions.</w:t>
       </w:r>
     </w:p>
-    <w:p ns2:paraId="2830204F" ns2:textId="77777777">
+    <w:p>
       <w:pPr>
         <w:pStyle w:val="ListBullet"/>
         <w:spacing w:after="20"/>
@@ -295,7 +301,7 @@
         <w:t>Complaint history, messaging, notifications, and post-resolution feedback where implemented.</w:t>
       </w:r>
     </w:p>
-    <w:p ns2:paraId="595443E0" ns2:textId="77777777">
+    <w:p>
       <w:pPr>
         <w:pStyle w:val="ListBullet"/>
         <w:spacing w:after="20"/>
@@ -304,7 +310,7 @@
         <w:t>Input validation, unauthorized access prevention, and dashboard data accuracy.</w:t>
       </w:r>
     </w:p>
-    <w:p ns2:paraId="10BCC5AA" ns2:textId="77777777">
+    <w:p>
       <w:pPr>
         <w:pStyle w:val="Heading2"/>
       </w:pPr>
@@ -312,7 +318,7 @@
         <w:t>Execution Instructions</w:t>
       </w:r>
     </w:p>
-    <w:p ns2:paraId="34F7C3B4" ns2:textId="77777777">
+    <w:p>
       <w:pPr>
         <w:pStyle w:val="ListNumber"/>
         <w:spacing w:after="20"/>
@@ -321,7 +327,7 @@
         <w:t>Run the frontend and backend and verify the database connection before testing.</w:t>
       </w:r>
     </w:p>
-    <w:p ns2:paraId="201BAC08" ns2:textId="77777777">
+    <w:p>
       <w:pPr>
         <w:pStyle w:val="ListNumber"/>
         <w:spacing w:after="20"/>
@@ -330,7 +336,7 @@
         <w:t>Use the test steps for each case and enter the observed result in the Actual Result column.</w:t>
       </w:r>
     </w:p>
-    <w:p ns2:paraId="60A36800" ns2:textId="77777777">
+    <w:p>
       <w:pPr>
         <w:pStyle w:val="ListNumber"/>
         <w:spacing w:after="20"/>
@@ -339,7 +345,7 @@
         <w:t>Mark a case Pass only when the observed behavior matches the expected result; otherwise mark Fail and record a defect.</w:t>
       </w:r>
     </w:p>
-    <w:p ns2:paraId="77D9B192" ns2:textId="77777777">
+    <w:p>
       <w:pPr>
         <w:pStyle w:val="ListNumber"/>
         <w:spacing w:after="20"/>
@@ -348,12 +354,12 @@
         <w:t>Use Not Run until a test has actually been executed. Re-test fixes before closing related defects.</w:t>
       </w:r>
     </w:p>
-    <w:p ns2:paraId="757E2B9E" ns2:textId="77777777">
+    <w:p>
       <w:r>
         <w:br w:type="page"/>
       </w:r>
     </w:p>
-    <w:p ns2:paraId="045C36BA" ns2:textId="77777777">
+    <w:p>
       <w:pPr>
         <w:pStyle w:val="Heading1"/>
       </w:pPr>
@@ -362,7 +368,7 @@
         <w:t>2. User Acceptance Test Cases — Part A</w:t>
       </w:r>
     </w:p>
-    <w:p ns2:paraId="60AC2774" ns2:textId="77777777">
+    <w:p>
       <w:r>
         <w:t>Complete the Actual Result and Status fields during execution. All cases below are initially marked Not Run.</w:t>
       </w:r>
@@ -382,7 +388,7 @@
         <w:gridCol w:w="1584"/>
         <w:gridCol w:w="792"/>
       </w:tblGrid>
-      <w:tr ns2:paraId="555C714F" ns2:textId="77777777">
+      <w:tr>
         <w:trPr>
           <w:cantSplit/>
           <w:tblHeader/>
@@ -400,7 +406,7 @@
             </w:tcMar>
             <w:vAlign w:val="center"/>
           </w:tcPr>
-          <w:p ns2:paraId="47727B96" ns2:textId="77777777">
+          <w:p>
             <w:pPr>
               <w:spacing w:after="0"/>
             </w:pPr>
@@ -425,7 +431,7 @@
             </w:tcMar>
             <w:vAlign w:val="center"/>
           </w:tcPr>
-          <w:p ns2:paraId="0DFBF94B" ns2:textId="77777777">
+          <w:p>
             <w:pPr>
               <w:spacing w:after="0"/>
             </w:pPr>
@@ -450,7 +456,7 @@
             </w:tcMar>
             <w:vAlign w:val="center"/>
           </w:tcPr>
-          <w:p ns2:paraId="169776E2" ns2:textId="77777777">
+          <w:p>
             <w:pPr>
               <w:spacing w:after="0"/>
             </w:pPr>
@@ -475,7 +481,7 @@
             </w:tcMar>
             <w:vAlign w:val="center"/>
           </w:tcPr>
-          <w:p ns2:paraId="4BB87E43" ns2:textId="77777777">
+          <w:p>
             <w:pPr>
               <w:spacing w:after="0"/>
             </w:pPr>
@@ -500,7 +506,7 @@
             </w:tcMar>
             <w:vAlign w:val="center"/>
           </w:tcPr>
-          <w:p ns2:paraId="7FD0B916" ns2:textId="77777777">
+          <w:p>
             <w:pPr>
               <w:spacing w:after="0"/>
             </w:pPr>
@@ -525,7 +531,7 @@
             </w:tcMar>
             <w:vAlign w:val="center"/>
           </w:tcPr>
-          <w:p ns2:paraId="05597EA7" ns2:textId="77777777">
+          <w:p>
             <w:pPr>
               <w:spacing w:after="0"/>
             </w:pPr>
@@ -539,7 +545,7 @@
           </w:p>
         </w:tc>
       </w:tr>
-      <w:tr ns2:paraId="57725CAA" ns2:textId="77777777">
+      <w:tr>
         <w:trPr>
           <w:cantSplit/>
           <w:jc w:val="center"/>
@@ -555,7 +561,7 @@
             </w:tcMar>
             <w:vAlign w:val="center"/>
           </w:tcPr>
-          <w:p ns2:paraId="5673B6B8" ns2:textId="77777777">
+          <w:p>
             <w:pPr>
               <w:spacing w:after="0"/>
             </w:pPr>
@@ -578,7 +584,7 @@
             </w:tcMar>
             <w:vAlign w:val="center"/>
           </w:tcPr>
-          <w:p ns2:paraId="30359493" ns2:textId="77777777">
+          <w:p>
             <w:pPr>
               <w:spacing w:after="0"/>
             </w:pPr>
@@ -601,7 +607,7 @@
             </w:tcMar>
             <w:vAlign w:val="center"/>
           </w:tcPr>
-          <w:p ns2:paraId="12919C2E" ns2:textId="77777777">
+          <w:p>
             <w:pPr>
               <w:spacing w:after="0"/>
             </w:pPr>
@@ -645,7 +651,7 @@
             </w:tcMar>
             <w:vAlign w:val="center"/>
           </w:tcPr>
-          <w:p ns2:paraId="77213CD7" ns2:textId="77777777">
+          <w:p>
             <w:pPr>
               <w:spacing w:after="0"/>
             </w:pPr>
@@ -668,7 +674,7 @@
             </w:tcMar>
             <w:vAlign w:val="center"/>
           </w:tcPr>
-          <w:p ns2:paraId="512803C8" ns2:textId="77777777">
+          <w:p>
             <w:pPr>
               <w:spacing w:after="0"/>
             </w:pPr>
@@ -688,7 +694,7 @@
             </w:tcMar>
             <w:vAlign w:val="center"/>
           </w:tcPr>
-          <w:p ns2:paraId="0725FD48" ns2:textId="77777777">
+          <w:p>
             <w:pPr>
               <w:spacing w:after="0"/>
             </w:pPr>
@@ -698,7 +704,7 @@
           </w:p>
         </w:tc>
       </w:tr>
-      <w:tr ns2:paraId="17DC9FCC" ns2:textId="77777777">
+      <w:tr>
         <w:trPr>
           <w:cantSplit/>
           <w:jc w:val="center"/>
@@ -714,7 +720,7 @@
             </w:tcMar>
             <w:vAlign w:val="center"/>
           </w:tcPr>
-          <w:p ns2:paraId="5959D7B9" ns2:textId="77777777">
+          <w:p>
             <w:pPr>
               <w:spacing w:after="0"/>
             </w:pPr>
@@ -737,7 +743,7 @@
             </w:tcMar>
             <w:vAlign w:val="center"/>
           </w:tcPr>
-          <w:p ns2:paraId="66B5B89C" ns2:textId="77777777">
+          <w:p>
             <w:pPr>
               <w:spacing w:after="0"/>
             </w:pPr>
@@ -760,7 +766,7 @@
             </w:tcMar>
             <w:vAlign w:val="center"/>
           </w:tcPr>
-          <w:p ns2:paraId="647821CB" ns2:textId="77777777">
+          <w:p>
             <w:pPr>
               <w:spacing w:after="0"/>
             </w:pPr>
@@ -797,7 +803,7 @@
             </w:tcMar>
             <w:vAlign w:val="center"/>
           </w:tcPr>
-          <w:p ns2:paraId="6FB562E0" ns2:textId="77777777">
+          <w:p>
             <w:pPr>
               <w:spacing w:after="0"/>
             </w:pPr>
@@ -820,7 +826,7 @@
             </w:tcMar>
             <w:vAlign w:val="center"/>
           </w:tcPr>
-          <w:p ns2:paraId="1C9F2E6D" ns2:textId="77777777">
+          <w:p>
             <w:pPr>
               <w:spacing w:after="0"/>
             </w:pPr>
@@ -840,7 +846,7 @@
             </w:tcMar>
             <w:vAlign w:val="center"/>
           </w:tcPr>
-          <w:p ns2:paraId="21C4D99A" ns2:textId="77777777">
+          <w:p>
             <w:pPr>
               <w:spacing w:after="0"/>
             </w:pPr>
@@ -850,7 +856,7 @@
           </w:p>
         </w:tc>
       </w:tr>
-      <w:tr ns2:paraId="17129BC1" ns2:textId="77777777">
+      <w:tr>
         <w:trPr>
           <w:cantSplit/>
           <w:jc w:val="center"/>
@@ -866,7 +872,7 @@
             </w:tcMar>
             <w:vAlign w:val="center"/>
           </w:tcPr>
-          <w:p ns2:paraId="05EB0717" ns2:textId="77777777">
+          <w:p>
             <w:pPr>
               <w:spacing w:after="0"/>
             </w:pPr>
@@ -889,7 +895,7 @@
             </w:tcMar>
             <w:vAlign w:val="center"/>
           </w:tcPr>
-          <w:p ns2:paraId="247BB6C1" ns2:textId="77777777">
+          <w:p>
             <w:pPr>
               <w:spacing w:after="0"/>
             </w:pPr>
@@ -912,7 +918,7 @@
             </w:tcMar>
             <w:vAlign w:val="center"/>
           </w:tcPr>
-          <w:p ns2:paraId="391EC2D6" ns2:textId="77777777">
+          <w:p>
             <w:pPr>
               <w:spacing w:after="0"/>
             </w:pPr>
@@ -949,7 +955,7 @@
             </w:tcMar>
             <w:vAlign w:val="center"/>
           </w:tcPr>
-          <w:p ns2:paraId="6C255279" ns2:textId="77777777">
+          <w:p>
             <w:pPr>
               <w:spacing w:after="0"/>
             </w:pPr>
@@ -972,7 +978,7 @@
             </w:tcMar>
             <w:vAlign w:val="center"/>
           </w:tcPr>
-          <w:p ns2:paraId="6ED9D7C7" ns2:textId="77777777">
+          <w:p>
             <w:pPr>
               <w:spacing w:after="0"/>
             </w:pPr>
@@ -992,7 +998,7 @@
             </w:tcMar>
             <w:vAlign w:val="center"/>
           </w:tcPr>
-          <w:p ns2:paraId="3637D5D2" ns2:textId="77777777">
+          <w:p>
             <w:pPr>
               <w:spacing w:after="0"/>
             </w:pPr>
@@ -1002,7 +1008,7 @@
           </w:p>
         </w:tc>
       </w:tr>
-      <w:tr ns2:paraId="622B0DD8" ns2:textId="77777777">
+      <w:tr>
         <w:trPr>
           <w:cantSplit/>
           <w:jc w:val="center"/>
@@ -1018,7 +1024,7 @@
             </w:tcMar>
             <w:vAlign w:val="center"/>
           </w:tcPr>
-          <w:p ns2:paraId="3FEDF303" ns2:textId="77777777">
+          <w:p>
             <w:pPr>
               <w:spacing w:after="0"/>
             </w:pPr>
@@ -1041,7 +1047,7 @@
             </w:tcMar>
             <w:vAlign w:val="center"/>
           </w:tcPr>
-          <w:p ns2:paraId="269080E6" ns2:textId="77777777">
+          <w:p>
             <w:pPr>
               <w:spacing w:after="0"/>
             </w:pPr>
@@ -1064,7 +1070,7 @@
             </w:tcMar>
             <w:vAlign w:val="center"/>
           </w:tcPr>
-          <w:p ns2:paraId="10ADC3FC" ns2:textId="77777777">
+          <w:p>
             <w:pPr>
               <w:spacing w:after="0"/>
             </w:pPr>
@@ -1101,7 +1107,7 @@
             </w:tcMar>
             <w:vAlign w:val="center"/>
           </w:tcPr>
-          <w:p ns2:paraId="75445882" ns2:textId="77777777">
+          <w:p>
             <w:pPr>
               <w:spacing w:after="0"/>
             </w:pPr>
@@ -1124,7 +1130,7 @@
             </w:tcMar>
             <w:vAlign w:val="center"/>
           </w:tcPr>
-          <w:p ns2:paraId="5A047BBF" ns2:textId="77777777">
+          <w:p>
             <w:pPr>
               <w:spacing w:after="0"/>
             </w:pPr>
@@ -1144,7 +1150,7 @@
             </w:tcMar>
             <w:vAlign w:val="center"/>
           </w:tcPr>
-          <w:p ns2:paraId="790C266D" ns2:textId="77777777">
+          <w:p>
             <w:pPr>
               <w:spacing w:after="0"/>
             </w:pPr>
@@ -1154,7 +1160,7 @@
           </w:p>
         </w:tc>
       </w:tr>
-      <w:tr ns2:paraId="003EF611" ns2:textId="77777777">
+      <w:tr>
         <w:trPr>
           <w:cantSplit/>
           <w:jc w:val="center"/>
@@ -1170,7 +1176,7 @@
             </w:tcMar>
             <w:vAlign w:val="center"/>
           </w:tcPr>
-          <w:p ns2:paraId="28BF0730" ns2:textId="77777777">
+          <w:p>
             <w:pPr>
               <w:spacing w:after="0"/>
             </w:pPr>
@@ -1193,7 +1199,7 @@
             </w:tcMar>
             <w:vAlign w:val="center"/>
           </w:tcPr>
-          <w:p ns2:paraId="43838F9C" ns2:textId="77777777">
+          <w:p>
             <w:pPr>
               <w:spacing w:after="0"/>
             </w:pPr>
@@ -1216,7 +1222,7 @@
             </w:tcMar>
             <w:vAlign w:val="center"/>
           </w:tcPr>
-          <w:p ns2:paraId="29291EFA" ns2:textId="77777777">
+          <w:p>
             <w:pPr>
               <w:spacing w:after="0"/>
             </w:pPr>
@@ -1253,7 +1259,7 @@
             </w:tcMar>
             <w:vAlign w:val="center"/>
           </w:tcPr>
-          <w:p ns2:paraId="2996255A" ns2:textId="77777777">
+          <w:p>
             <w:pPr>
               <w:spacing w:after="0"/>
             </w:pPr>
@@ -1276,7 +1282,7 @@
             </w:tcMar>
             <w:vAlign w:val="center"/>
           </w:tcPr>
-          <w:p ns2:paraId="0023C0F2" ns2:textId="77777777">
+          <w:p>
             <w:pPr>
               <w:spacing w:after="0"/>
             </w:pPr>
@@ -1296,7 +1302,7 @@
             </w:tcMar>
             <w:vAlign w:val="center"/>
           </w:tcPr>
-          <w:p ns2:paraId="76ADAFD2" ns2:textId="77777777">
+          <w:p>
             <w:pPr>
               <w:spacing w:after="0"/>
             </w:pPr>
@@ -1307,12 +1313,12 @@
         </w:tc>
       </w:tr>
     </w:tbl>
-    <w:p ns2:paraId="0A72A5E6" ns2:textId="77777777">
+    <w:p>
       <w:r>
         <w:br w:type="page"/>
       </w:r>
     </w:p>
-    <w:p ns2:paraId="6B53131D" ns2:textId="77777777">
+    <w:p>
       <w:pPr>
         <w:pStyle w:val="Heading1"/>
       </w:pPr>
@@ -1336,7 +1342,7 @@
         <w:gridCol w:w="1584"/>
         <w:gridCol w:w="792"/>
       </w:tblGrid>
-      <w:tr ns2:paraId="65B9AAD0" ns2:textId="77777777">
+      <w:tr>
         <w:trPr>
           <w:cantSplit/>
           <w:tblHeader/>
@@ -1354,7 +1360,7 @@
             </w:tcMar>
             <w:vAlign w:val="center"/>
           </w:tcPr>
-          <w:p ns2:paraId="6D112E58" ns2:textId="77777777">
+          <w:p>
             <w:pPr>
               <w:spacing w:after="0"/>
             </w:pPr>
@@ -1379,7 +1385,7 @@
             </w:tcMar>
             <w:vAlign w:val="center"/>
           </w:tcPr>
-          <w:p ns2:paraId="472BC966" ns2:textId="77777777">
+          <w:p>
             <w:pPr>
               <w:spacing w:after="0"/>
             </w:pPr>
@@ -1404,7 +1410,7 @@
             </w:tcMar>
             <w:vAlign w:val="center"/>
           </w:tcPr>
-          <w:p ns2:paraId="75DA2964" ns2:textId="77777777">
+          <w:p>
             <w:pPr>
               <w:spacing w:after="0"/>
             </w:pPr>
@@ -1429,7 +1435,7 @@
             </w:tcMar>
             <w:vAlign w:val="center"/>
           </w:tcPr>
-          <w:p ns2:paraId="4D72CB47" ns2:textId="77777777">
+          <w:p>
             <w:pPr>
               <w:spacing w:after="0"/>
             </w:pPr>
@@ -1454,7 +1460,7 @@
             </w:tcMar>
             <w:vAlign w:val="center"/>
           </w:tcPr>
-          <w:p ns2:paraId="47ED36A3" ns2:textId="77777777">
+          <w:p>
             <w:pPr>
               <w:spacing w:after="0"/>
             </w:pPr>
@@ -1479,7 +1485,7 @@
             </w:tcMar>
             <w:vAlign w:val="center"/>
           </w:tcPr>
-          <w:p ns2:paraId="7255EEDE" ns2:textId="77777777">
+          <w:p>
             <w:pPr>
               <w:spacing w:after="0"/>
             </w:pPr>
@@ -1493,7 +1499,7 @@
           </w:p>
         </w:tc>
       </w:tr>
-      <w:tr ns2:paraId="15CFF9E7" ns2:textId="77777777">
+      <w:tr>
         <w:trPr>
           <w:cantSplit/>
           <w:jc w:val="center"/>
@@ -1509,7 +1515,7 @@
             </w:tcMar>
             <w:vAlign w:val="center"/>
           </w:tcPr>
-          <w:p ns2:paraId="1EDAEA9F" ns2:textId="77777777">
+          <w:p>
             <w:pPr>
               <w:spacing w:after="0"/>
             </w:pPr>
@@ -1532,7 +1538,7 @@
             </w:tcMar>
             <w:vAlign w:val="center"/>
           </w:tcPr>
-          <w:p ns2:paraId="4F678F4E" ns2:textId="77777777">
+          <w:p>
             <w:pPr>
               <w:spacing w:after="0"/>
             </w:pPr>
@@ -1555,7 +1561,7 @@
             </w:tcMar>
             <w:vAlign w:val="center"/>
           </w:tcPr>
-          <w:p ns2:paraId="52F1905B" ns2:textId="77777777">
+          <w:p>
             <w:pPr>
               <w:spacing w:after="0"/>
             </w:pPr>
@@ -1599,7 +1605,7 @@
             </w:tcMar>
             <w:vAlign w:val="center"/>
           </w:tcPr>
-          <w:p ns2:paraId="183BD7EA" ns2:textId="77777777">
+          <w:p>
             <w:pPr>
               <w:spacing w:after="0"/>
             </w:pPr>
@@ -1622,7 +1628,7 @@
             </w:tcMar>
             <w:vAlign w:val="center"/>
           </w:tcPr>
-          <w:p ns2:paraId="4AD6F237" ns2:textId="77777777">
+          <w:p>
             <w:pPr>
               <w:spacing w:after="0"/>
             </w:pPr>
@@ -1642,7 +1648,7 @@
             </w:tcMar>
             <w:vAlign w:val="center"/>
           </w:tcPr>
-          <w:p ns2:paraId="33170963" ns2:textId="77777777">
+          <w:p>
             <w:pPr>
               <w:spacing w:after="0"/>
             </w:pPr>
@@ -1652,7 +1658,7 @@
           </w:p>
         </w:tc>
       </w:tr>
-      <w:tr ns2:paraId="25B4C314" ns2:textId="77777777">
+      <w:tr>
         <w:trPr>
           <w:cantSplit/>
           <w:jc w:val="center"/>
@@ -1668,7 +1674,7 @@
             </w:tcMar>
             <w:vAlign w:val="center"/>
           </w:tcPr>
-          <w:p ns2:paraId="66B2CBB6" ns2:textId="77777777">
+          <w:p>
             <w:pPr>
               <w:spacing w:after="0"/>
             </w:pPr>
@@ -1691,7 +1697,7 @@
             </w:tcMar>
             <w:vAlign w:val="center"/>
           </w:tcPr>
-          <w:p ns2:paraId="743DF92E" ns2:textId="77777777">
+          <w:p>
             <w:pPr>
               <w:spacing w:after="0"/>
             </w:pPr>
@@ -1714,7 +1720,7 @@
             </w:tcMar>
             <w:vAlign w:val="center"/>
           </w:tcPr>
-          <w:p ns2:paraId="088D416A" ns2:textId="77777777">
+          <w:p>
             <w:pPr>
               <w:spacing w:after="0"/>
             </w:pPr>
@@ -1758,7 +1764,7 @@
             </w:tcMar>
             <w:vAlign w:val="center"/>
           </w:tcPr>
-          <w:p ns2:paraId="2E1341F8" ns2:textId="77777777">
+          <w:p>
             <w:pPr>
               <w:spacing w:after="0"/>
             </w:pPr>
@@ -1781,7 +1787,7 @@
             </w:tcMar>
             <w:vAlign w:val="center"/>
           </w:tcPr>
-          <w:p ns2:paraId="33D6A55B" ns2:textId="77777777">
+          <w:p>
             <w:pPr>
               <w:spacing w:after="0"/>
             </w:pPr>
@@ -1801,7 +1807,7 @@
             </w:tcMar>
             <w:vAlign w:val="center"/>
           </w:tcPr>
-          <w:p ns2:paraId="4C925ADE" ns2:textId="77777777">
+          <w:p>
             <w:pPr>
               <w:spacing w:after="0"/>
             </w:pPr>
@@ -1811,7 +1817,7 @@
           </w:p>
         </w:tc>
       </w:tr>
-      <w:tr ns2:paraId="05A5F16E" ns2:textId="77777777">
+      <w:tr>
         <w:trPr>
           <w:cantSplit/>
           <w:jc w:val="center"/>
@@ -1827,7 +1833,7 @@
             </w:tcMar>
             <w:vAlign w:val="center"/>
           </w:tcPr>
-          <w:p ns2:paraId="22AC943C" ns2:textId="77777777">
+          <w:p>
             <w:pPr>
               <w:spacing w:after="0"/>
             </w:pPr>
@@ -1850,7 +1856,7 @@
             </w:tcMar>
             <w:vAlign w:val="center"/>
           </w:tcPr>
-          <w:p ns2:paraId="51BF7D97" ns2:textId="77777777">
+          <w:p>
             <w:pPr>
               <w:spacing w:after="0"/>
             </w:pPr>
@@ -1873,7 +1879,7 @@
             </w:tcMar>
             <w:vAlign w:val="center"/>
           </w:tcPr>
-          <w:p ns2:paraId="3A41E1BF" ns2:textId="77777777">
+          <w:p>
             <w:pPr>
               <w:spacing w:after="0"/>
             </w:pPr>
@@ -1917,7 +1923,7 @@
             </w:tcMar>
             <w:vAlign w:val="center"/>
           </w:tcPr>
-          <w:p ns2:paraId="0C7E38B4" ns2:textId="77777777">
+          <w:p>
             <w:pPr>
               <w:spacing w:after="0"/>
             </w:pPr>
@@ -1940,7 +1946,7 @@
             </w:tcMar>
             <w:vAlign w:val="center"/>
           </w:tcPr>
-          <w:p ns2:paraId="6151FC79" ns2:textId="77777777">
+          <w:p>
             <w:pPr>
               <w:spacing w:after="0"/>
             </w:pPr>
@@ -1960,7 +1966,7 @@
             </w:tcMar>
             <w:vAlign w:val="center"/>
           </w:tcPr>
-          <w:p ns2:paraId="214F98CF" ns2:textId="77777777">
+          <w:p>
             <w:pPr>
               <w:spacing w:after="0"/>
             </w:pPr>
@@ -1970,7 +1976,7 @@
           </w:p>
         </w:tc>
       </w:tr>
-      <w:tr ns2:paraId="7FEF0FD3" ns2:textId="77777777">
+      <w:tr>
         <w:trPr>
           <w:cantSplit/>
           <w:jc w:val="center"/>
@@ -1986,7 +1992,7 @@
             </w:tcMar>
             <w:vAlign w:val="center"/>
           </w:tcPr>
-          <w:p ns2:paraId="4A2BAD3A" ns2:textId="77777777">
+          <w:p>
             <w:pPr>
               <w:spacing w:after="0"/>
             </w:pPr>
@@ -2009,7 +2015,7 @@
             </w:tcMar>
             <w:vAlign w:val="center"/>
           </w:tcPr>
-          <w:p ns2:paraId="08A1609E" ns2:textId="77777777">
+          <w:p>
             <w:pPr>
               <w:spacing w:after="0"/>
             </w:pPr>
@@ -2032,7 +2038,7 @@
             </w:tcMar>
             <w:vAlign w:val="center"/>
           </w:tcPr>
-          <w:p ns2:paraId="32043902" ns2:textId="77777777">
+          <w:p>
             <w:pPr>
               <w:spacing w:after="0"/>
             </w:pPr>
@@ -2076,7 +2082,7 @@
             </w:tcMar>
             <w:vAlign w:val="center"/>
           </w:tcPr>
-          <w:p ns2:paraId="670BD0A0" ns2:textId="77777777">
+          <w:p>
             <w:pPr>
               <w:spacing w:after="0"/>
             </w:pPr>
@@ -2099,7 +2105,7 @@
             </w:tcMar>
             <w:vAlign w:val="center"/>
           </w:tcPr>
-          <w:p ns2:paraId="4B4F6E3B" ns2:textId="77777777">
+          <w:p>
             <w:pPr>
               <w:spacing w:after="0"/>
             </w:pPr>
@@ -2119,7 +2125,7 @@
             </w:tcMar>
             <w:vAlign w:val="center"/>
           </w:tcPr>
-          <w:p ns2:paraId="41449AAF" ns2:textId="77777777">
+          <w:p>
             <w:pPr>
               <w:spacing w:after="0"/>
             </w:pPr>
@@ -2129,7 +2135,7 @@
           </w:p>
         </w:tc>
       </w:tr>
-      <w:tr ns2:paraId="54207C51" ns2:textId="77777777">
+      <w:tr>
         <w:trPr>
           <w:cantSplit/>
           <w:jc w:val="center"/>
@@ -2145,7 +2151,7 @@
             </w:tcMar>
             <w:vAlign w:val="center"/>
           </w:tcPr>
-          <w:p ns2:paraId="113F1335" ns2:textId="77777777">
+          <w:p>
             <w:pPr>
               <w:spacing w:after="0"/>
             </w:pPr>
@@ -2168,7 +2174,7 @@
             </w:tcMar>
             <w:vAlign w:val="center"/>
           </w:tcPr>
-          <w:p ns2:paraId="3BD08DFA" ns2:textId="77777777">
+          <w:p>
             <w:pPr>
               <w:spacing w:after="0"/>
             </w:pPr>
@@ -2191,7 +2197,7 @@
             </w:tcMar>
             <w:vAlign w:val="center"/>
           </w:tcPr>
-          <w:p ns2:paraId="4AE392BA" ns2:textId="77777777">
+          <w:p>
             <w:pPr>
               <w:spacing w:after="0"/>
             </w:pPr>
@@ -2235,7 +2241,7 @@
             </w:tcMar>
             <w:vAlign w:val="center"/>
           </w:tcPr>
-          <w:p ns2:paraId="1780BA6C" ns2:textId="77777777">
+          <w:p>
             <w:pPr>
               <w:spacing w:after="0"/>
             </w:pPr>
@@ -2258,7 +2264,7 @@
             </w:tcMar>
             <w:vAlign w:val="center"/>
           </w:tcPr>
-          <w:p ns2:paraId="407C7456" ns2:textId="77777777">
+          <w:p>
             <w:pPr>
               <w:spacing w:after="0"/>
             </w:pPr>
@@ -2278,7 +2284,7 @@
             </w:tcMar>
             <w:vAlign w:val="center"/>
           </w:tcPr>
-          <w:p ns2:paraId="0187DC71" ns2:textId="77777777">
+          <w:p>
             <w:pPr>
               <w:spacing w:after="0"/>
             </w:pPr>
@@ -2288,7 +2294,7 @@
           </w:p>
         </w:tc>
       </w:tr>
-      <w:tr ns2:paraId="3AF53739" ns2:textId="77777777">
+      <w:tr>
         <w:trPr>
           <w:cantSplit/>
           <w:jc w:val="center"/>
@@ -2304,7 +2310,7 @@
             </w:tcMar>
             <w:vAlign w:val="center"/>
           </w:tcPr>
-          <w:p ns2:paraId="7D4E2224" ns2:textId="77777777">
+          <w:p>
             <w:pPr>
               <w:spacing w:after="0"/>
             </w:pPr>
@@ -2312,6 +2318,7 @@
               <w:rPr>
                 <w:sz w:val="15"/>
               </w:rPr>
+              <w:lastRenderedPageBreak/>
               <w:t>TC-011</w:t>
             </w:r>
           </w:p>
@@ -2327,7 +2334,7 @@
             </w:tcMar>
             <w:vAlign w:val="center"/>
           </w:tcPr>
-          <w:p ns2:paraId="3980A7E7" ns2:textId="77777777">
+          <w:p>
             <w:pPr>
               <w:spacing w:after="0"/>
             </w:pPr>
@@ -2350,7 +2357,7 @@
             </w:tcMar>
             <w:vAlign w:val="center"/>
           </w:tcPr>
-          <w:p ns2:paraId="17B62741" ns2:textId="77777777">
+          <w:p>
             <w:pPr>
               <w:spacing w:after="0"/>
             </w:pPr>
@@ -2387,7 +2394,7 @@
             </w:tcMar>
             <w:vAlign w:val="center"/>
           </w:tcPr>
-          <w:p ns2:paraId="420CB664" ns2:textId="77777777">
+          <w:p>
             <w:pPr>
               <w:spacing w:after="0"/>
             </w:pPr>
@@ -2410,7 +2417,7 @@
             </w:tcMar>
             <w:vAlign w:val="center"/>
           </w:tcPr>
-          <w:p ns2:paraId="7CBDE2A1" ns2:textId="77777777">
+          <w:p>
             <w:pPr>
               <w:spacing w:after="0"/>
             </w:pPr>
@@ -2430,7 +2437,7 @@
             </w:tcMar>
             <w:vAlign w:val="center"/>
           </w:tcPr>
-          <w:p ns2:paraId="1BAC458F" ns2:textId="77777777">
+          <w:p>
             <w:pPr>
               <w:spacing w:after="0"/>
             </w:pPr>
@@ -2440,7 +2447,7 @@
           </w:p>
         </w:tc>
       </w:tr>
-      <w:tr ns2:paraId="53F55612" ns2:textId="77777777">
+      <w:tr>
         <w:trPr>
           <w:cantSplit/>
           <w:jc w:val="center"/>
@@ -2456,7 +2463,7 @@
             </w:tcMar>
             <w:vAlign w:val="center"/>
           </w:tcPr>
-          <w:p ns2:paraId="6C5448FE" ns2:textId="77777777">
+          <w:p>
             <w:pPr>
               <w:spacing w:after="0"/>
             </w:pPr>
@@ -2479,7 +2486,7 @@
             </w:tcMar>
             <w:vAlign w:val="center"/>
           </w:tcPr>
-          <w:p ns2:paraId="78811675" ns2:textId="77777777">
+          <w:p>
             <w:pPr>
               <w:spacing w:after="0"/>
             </w:pPr>
@@ -2502,7 +2509,7 @@
             </w:tcMar>
             <w:vAlign w:val="center"/>
           </w:tcPr>
-          <w:p ns2:paraId="0B476CC9" ns2:textId="77777777">
+          <w:p>
             <w:pPr>
               <w:spacing w:after="0"/>
             </w:pPr>
@@ -2539,7 +2546,7 @@
             </w:tcMar>
             <w:vAlign w:val="center"/>
           </w:tcPr>
-          <w:p ns2:paraId="4E250C3F" ns2:textId="77777777">
+          <w:p>
             <w:pPr>
               <w:spacing w:after="0"/>
             </w:pPr>
@@ -2562,7 +2569,7 @@
             </w:tcMar>
             <w:vAlign w:val="center"/>
           </w:tcPr>
-          <w:p ns2:paraId="7E53B3AF" ns2:textId="77777777">
+          <w:p>
             <w:pPr>
               <w:spacing w:after="0"/>
             </w:pPr>
@@ -2582,7 +2589,7 @@
             </w:tcMar>
             <w:vAlign w:val="center"/>
           </w:tcPr>
-          <w:p ns2:paraId="6C2148DE" ns2:textId="77777777">
+          <w:p>
             <w:pPr>
               <w:spacing w:after="0"/>
             </w:pPr>
@@ -2593,12 +2600,12 @@
         </w:tc>
       </w:tr>
     </w:tbl>
-    <w:p ns2:paraId="05F3E043" ns2:textId="77777777">
+    <w:p>
       <w:r>
         <w:br w:type="page"/>
       </w:r>
     </w:p>
-    <w:p ns2:paraId="77EF1725" ns2:textId="77777777">
+    <w:p>
       <w:pPr>
         <w:pStyle w:val="Heading1"/>
       </w:pPr>
@@ -2607,7 +2614,7 @@
         <w:t>3. System Defect Register &amp; Bug Tracking</w:t>
       </w:r>
     </w:p>
-    <w:p ns2:paraId="2A57D81C" ns2:textId="77777777">
+    <w:p>
       <w:r>
         <w:t>Record defects discovered during UAT. No defect status is pre-filled because the application has not been tested as part of preparing this document.</w:t>
       </w:r>
@@ -2622,12 +2629,12 @@
       <w:tblGrid>
         <w:gridCol w:w="936"/>
         <w:gridCol w:w="1080"/>
-        <w:gridCol w:w="2376"/>
+        <w:gridCol w:w="2472"/>
         <w:gridCol w:w="1008"/>
         <w:gridCol w:w="1080"/>
-        <w:gridCol w:w="2592"/>
+        <w:gridCol w:w="3132"/>
       </w:tblGrid>
-      <w:tr ns2:paraId="4C06B903" ns2:textId="77777777">
+      <w:tr>
         <w:trPr>
           <w:cantSplit/>
           <w:tblHeader/>
@@ -2645,7 +2652,7 @@
             </w:tcMar>
             <w:vAlign w:val="center"/>
           </w:tcPr>
-          <w:p ns2:paraId="070A72C8" ns2:textId="77777777">
+          <w:p>
             <w:pPr>
               <w:spacing w:after="0"/>
             </w:pPr>
@@ -2670,7 +2677,7 @@
             </w:tcMar>
             <w:vAlign w:val="center"/>
           </w:tcPr>
-          <w:p ns2:paraId="36E21682" ns2:textId="77777777">
+          <w:p>
             <w:pPr>
               <w:spacing w:after="0"/>
             </w:pPr>
@@ -2695,7 +2702,7 @@
             </w:tcMar>
             <w:vAlign w:val="center"/>
           </w:tcPr>
-          <w:p ns2:paraId="1A864761" ns2:textId="77777777">
+          <w:p>
             <w:pPr>
               <w:spacing w:after="0"/>
             </w:pPr>
@@ -2720,7 +2727,7 @@
             </w:tcMar>
             <w:vAlign w:val="center"/>
           </w:tcPr>
-          <w:p ns2:paraId="2C6D1906" ns2:textId="77777777">
+          <w:p>
             <w:pPr>
               <w:spacing w:after="0"/>
             </w:pPr>
@@ -2745,7 +2752,7 @@
             </w:tcMar>
             <w:vAlign w:val="center"/>
           </w:tcPr>
-          <w:p ns2:paraId="7065CB47" ns2:textId="77777777">
+          <w:p>
             <w:pPr>
               <w:spacing w:after="0"/>
             </w:pPr>
@@ -2770,7 +2777,7 @@
             </w:tcMar>
             <w:vAlign w:val="center"/>
           </w:tcPr>
-          <w:p ns2:paraId="0C34434E" ns2:textId="77777777">
+          <w:p>
             <w:pPr>
               <w:spacing w:after="0"/>
             </w:pPr>
@@ -2784,7 +2791,7 @@
           </w:p>
         </w:tc>
       </w:tr>
-      <w:tr ns2:paraId="46F1E434" ns2:textId="77777777">
+      <w:tr>
         <w:trPr>
           <w:cantSplit/>
           <w:jc w:val="center"/>
@@ -2800,7 +2807,7 @@
             </w:tcMar>
             <w:vAlign w:val="center"/>
           </w:tcPr>
-          <w:p ns2:paraId="38F49257" ns2:textId="77777777">
+          <w:p>
             <w:pPr>
               <w:spacing w:after="0"/>
             </w:pPr>
@@ -2820,7 +2827,7 @@
             </w:tcMar>
             <w:vAlign w:val="center"/>
           </w:tcPr>
-          <w:p ns2:paraId="199EDCD0" ns2:textId="77777777">
+          <w:p>
             <w:pPr>
               <w:spacing w:after="0"/>
             </w:pPr>
@@ -2840,7 +2847,7 @@
             </w:tcMar>
             <w:vAlign w:val="center"/>
           </w:tcPr>
-          <w:p ns2:paraId="7E89DCCB" ns2:textId="77777777">
+          <w:p>
             <w:pPr>
               <w:spacing w:after="0"/>
             </w:pPr>
@@ -2860,7 +2867,7 @@
             </w:tcMar>
             <w:vAlign w:val="center"/>
           </w:tcPr>
-          <w:p ns2:paraId="09E851A8" ns2:textId="77777777">
+          <w:p>
             <w:pPr>
               <w:spacing w:after="0"/>
             </w:pPr>
@@ -2880,7 +2887,7 @@
             </w:tcMar>
             <w:vAlign w:val="center"/>
           </w:tcPr>
-          <w:p ns2:paraId="309161E4" ns2:textId="77777777">
+          <w:p>
             <w:pPr>
               <w:spacing w:after="0"/>
             </w:pPr>
@@ -2900,7 +2907,7 @@
             </w:tcMar>
             <w:vAlign w:val="center"/>
           </w:tcPr>
-          <w:p ns2:paraId="546522B9" ns2:textId="77777777">
+          <w:p>
             <w:pPr>
               <w:spacing w:after="0"/>
             </w:pPr>
@@ -2910,7 +2917,7 @@
           </w:p>
         </w:tc>
       </w:tr>
-      <w:tr ns2:paraId="46F1E434" ns2:textId="77777777">
+      <w:tr>
         <w:trPr>
           <w:cantSplit/>
           <w:jc w:val="center"/>
@@ -2926,7 +2933,7 @@
             </w:tcMar>
             <w:vAlign w:val="center"/>
           </w:tcPr>
-          <w:p ns2:paraId="38F49257" ns2:textId="77777777">
+          <w:p>
             <w:pPr>
               <w:spacing w:after="0"/>
             </w:pPr>
@@ -2946,7 +2953,7 @@
             </w:tcMar>
             <w:vAlign w:val="center"/>
           </w:tcPr>
-          <w:p ns2:paraId="199EDCD0" ns2:textId="77777777">
+          <w:p>
             <w:pPr>
               <w:spacing w:after="0"/>
             </w:pPr>
@@ -2966,7 +2973,7 @@
             </w:tcMar>
             <w:vAlign w:val="center"/>
           </w:tcPr>
-          <w:p ns2:paraId="7E89DCCB" ns2:textId="77777777">
+          <w:p>
             <w:pPr>
               <w:spacing w:after="0"/>
             </w:pPr>
@@ -2986,7 +2993,7 @@
             </w:tcMar>
             <w:vAlign w:val="center"/>
           </w:tcPr>
-          <w:p ns2:paraId="09E851A8" ns2:textId="77777777">
+          <w:p>
             <w:pPr>
               <w:spacing w:after="0"/>
             </w:pPr>
@@ -3006,7 +3013,7 @@
             </w:tcMar>
             <w:vAlign w:val="center"/>
           </w:tcPr>
-          <w:p ns2:paraId="309161E4" ns2:textId="77777777">
+          <w:p>
             <w:pPr>
               <w:spacing w:after="0"/>
             </w:pPr>
@@ -3026,7 +3033,7 @@
             </w:tcMar>
             <w:vAlign w:val="center"/>
           </w:tcPr>
-          <w:p ns2:paraId="546522B9" ns2:textId="77777777">
+          <w:p>
             <w:pPr>
               <w:spacing w:after="0"/>
             </w:pPr>
@@ -3036,7 +3043,7 @@
           </w:p>
         </w:tc>
       </w:tr>
-      <w:tr ns2:paraId="46F1E434" ns2:textId="77777777">
+      <w:tr>
         <w:trPr>
           <w:cantSplit/>
           <w:jc w:val="center"/>
@@ -3052,7 +3059,7 @@
             </w:tcMar>
             <w:vAlign w:val="center"/>
           </w:tcPr>
-          <w:p ns2:paraId="38F49257" ns2:textId="77777777">
+          <w:p>
             <w:pPr>
               <w:spacing w:after="0"/>
             </w:pPr>
@@ -3072,7 +3079,7 @@
             </w:tcMar>
             <w:vAlign w:val="center"/>
           </w:tcPr>
-          <w:p ns2:paraId="199EDCD0" ns2:textId="77777777">
+          <w:p>
             <w:pPr>
               <w:spacing w:after="0"/>
             </w:pPr>
@@ -3092,7 +3099,7 @@
             </w:tcMar>
             <w:vAlign w:val="center"/>
           </w:tcPr>
-          <w:p ns2:paraId="7E89DCCB" ns2:textId="77777777">
+          <w:p>
             <w:pPr>
               <w:spacing w:after="0"/>
             </w:pPr>
@@ -3112,7 +3119,7 @@
             </w:tcMar>
             <w:vAlign w:val="center"/>
           </w:tcPr>
-          <w:p ns2:paraId="09E851A8" ns2:textId="77777777">
+          <w:p>
             <w:pPr>
               <w:spacing w:after="0"/>
             </w:pPr>
@@ -3132,7 +3139,7 @@
             </w:tcMar>
             <w:vAlign w:val="center"/>
           </w:tcPr>
-          <w:p ns2:paraId="309161E4" ns2:textId="77777777">
+          <w:p>
             <w:pPr>
               <w:spacing w:after="0"/>
             </w:pPr>
@@ -3152,7 +3159,7 @@
             </w:tcMar>
             <w:vAlign w:val="center"/>
           </w:tcPr>
-          <w:p ns2:paraId="546522B9" ns2:textId="77777777">
+          <w:p>
             <w:pPr>
               <w:spacing w:after="0"/>
             </w:pPr>
@@ -3162,7 +3169,7 @@
           </w:p>
         </w:tc>
       </w:tr>
-      <w:tr ns2:paraId="46F1E434" ns2:textId="77777777">
+      <w:tr>
         <w:trPr>
           <w:cantSplit/>
           <w:jc w:val="center"/>
@@ -3178,7 +3185,7 @@
             </w:tcMar>
             <w:vAlign w:val="center"/>
           </w:tcPr>
-          <w:p ns2:paraId="38F49257" ns2:textId="77777777">
+          <w:p>
             <w:pPr>
               <w:spacing w:after="0"/>
             </w:pPr>
@@ -3198,7 +3205,7 @@
             </w:tcMar>
             <w:vAlign w:val="center"/>
           </w:tcPr>
-          <w:p ns2:paraId="199EDCD0" ns2:textId="77777777">
+          <w:p>
             <w:pPr>
               <w:spacing w:after="0"/>
             </w:pPr>
@@ -3218,7 +3225,7 @@
             </w:tcMar>
             <w:vAlign w:val="center"/>
           </w:tcPr>
-          <w:p ns2:paraId="7E89DCCB" ns2:textId="77777777">
+          <w:p>
             <w:pPr>
               <w:spacing w:after="0"/>
             </w:pPr>
@@ -3238,7 +3245,7 @@
             </w:tcMar>
             <w:vAlign w:val="center"/>
           </w:tcPr>
-          <w:p ns2:paraId="09E851A8" ns2:textId="77777777">
+          <w:p>
             <w:pPr>
               <w:spacing w:after="0"/>
             </w:pPr>
@@ -3258,7 +3265,7 @@
             </w:tcMar>
             <w:vAlign w:val="center"/>
           </w:tcPr>
-          <w:p ns2:paraId="309161E4" ns2:textId="77777777">
+          <w:p>
             <w:pPr>
               <w:spacing w:after="0"/>
             </w:pPr>
@@ -3278,7 +3285,7 @@
             </w:tcMar>
             <w:vAlign w:val="center"/>
           </w:tcPr>
-          <w:p ns2:paraId="546522B9" ns2:textId="77777777">
+          <w:p>
             <w:pPr>
               <w:spacing w:after="0"/>
             </w:pPr>
@@ -3288,7 +3295,7 @@
           </w:p>
         </w:tc>
       </w:tr>
-      <w:tr ns2:paraId="46F1E434" ns2:textId="77777777">
+      <w:tr>
         <w:trPr>
           <w:cantSplit/>
           <w:jc w:val="center"/>
@@ -3304,7 +3311,7 @@
             </w:tcMar>
             <w:vAlign w:val="center"/>
           </w:tcPr>
-          <w:p ns2:paraId="38F49257" ns2:textId="77777777">
+          <w:p>
             <w:pPr>
               <w:spacing w:after="0"/>
             </w:pPr>
@@ -3324,7 +3331,7 @@
             </w:tcMar>
             <w:vAlign w:val="center"/>
           </w:tcPr>
-          <w:p ns2:paraId="199EDCD0" ns2:textId="77777777">
+          <w:p>
             <w:pPr>
               <w:spacing w:after="0"/>
             </w:pPr>
@@ -3344,7 +3351,7 @@
             </w:tcMar>
             <w:vAlign w:val="center"/>
           </w:tcPr>
-          <w:p ns2:paraId="7E89DCCB" ns2:textId="77777777">
+          <w:p>
             <w:pPr>
               <w:spacing w:after="0"/>
             </w:pPr>
@@ -3364,7 +3371,7 @@
             </w:tcMar>
             <w:vAlign w:val="center"/>
           </w:tcPr>
-          <w:p ns2:paraId="09E851A8" ns2:textId="77777777">
+          <w:p>
             <w:pPr>
               <w:spacing w:after="0"/>
             </w:pPr>
@@ -3384,7 +3391,7 @@
             </w:tcMar>
             <w:vAlign w:val="center"/>
           </w:tcPr>
-          <w:p ns2:paraId="309161E4" ns2:textId="77777777">
+          <w:p>
             <w:pPr>
               <w:spacing w:after="0"/>
             </w:pPr>
@@ -3404,7 +3411,7 @@
             </w:tcMar>
             <w:vAlign w:val="center"/>
           </w:tcPr>
-          <w:p ns2:paraId="546522B9" ns2:textId="77777777">
+          <w:p>
             <w:pPr>
               <w:spacing w:after="0"/>
             </w:pPr>
@@ -3414,7 +3421,7 @@
           </w:p>
         </w:tc>
       </w:tr>
-      <w:tr ns2:paraId="46F1E434" ns2:textId="77777777">
+      <w:tr>
         <w:trPr>
           <w:cantSplit/>
           <w:jc w:val="center"/>
@@ -3430,7 +3437,7 @@
             </w:tcMar>
             <w:vAlign w:val="center"/>
           </w:tcPr>
-          <w:p ns2:paraId="38F49257" ns2:textId="77777777">
+          <w:p>
             <w:pPr>
               <w:spacing w:after="0"/>
             </w:pPr>
@@ -3450,7 +3457,7 @@
             </w:tcMar>
             <w:vAlign w:val="center"/>
           </w:tcPr>
-          <w:p ns2:paraId="199EDCD0" ns2:textId="77777777">
+          <w:p>
             <w:pPr>
               <w:spacing w:after="0"/>
             </w:pPr>
@@ -3470,7 +3477,7 @@
             </w:tcMar>
             <w:vAlign w:val="center"/>
           </w:tcPr>
-          <w:p ns2:paraId="7E89DCCB" ns2:textId="77777777">
+          <w:p>
             <w:pPr>
               <w:spacing w:after="0"/>
             </w:pPr>
@@ -3490,7 +3497,7 @@
             </w:tcMar>
             <w:vAlign w:val="center"/>
           </w:tcPr>
-          <w:p ns2:paraId="09E851A8" ns2:textId="77777777">
+          <w:p>
             <w:pPr>
               <w:spacing w:after="0"/>
             </w:pPr>
@@ -3510,7 +3517,7 @@
             </w:tcMar>
             <w:vAlign w:val="center"/>
           </w:tcPr>
-          <w:p ns2:paraId="309161E4" ns2:textId="77777777">
+          <w:p>
             <w:pPr>
               <w:spacing w:after="0"/>
             </w:pPr>
@@ -3530,7 +3537,7 @@
             </w:tcMar>
             <w:vAlign w:val="center"/>
           </w:tcPr>
-          <w:p ns2:paraId="546522B9" ns2:textId="77777777">
+          <w:p>
             <w:pPr>
               <w:spacing w:after="0"/>
             </w:pPr>
@@ -3540,7 +3547,7 @@
           </w:p>
         </w:tc>
       </w:tr>
-      <w:tr ns2:paraId="46F1E434" ns2:textId="77777777">
+      <w:tr>
         <w:trPr>
           <w:cantSplit/>
           <w:jc w:val="center"/>
@@ -3556,7 +3563,7 @@
             </w:tcMar>
             <w:vAlign w:val="center"/>
           </w:tcPr>
-          <w:p ns2:paraId="38F49257" ns2:textId="77777777">
+          <w:p>
             <w:pPr>
               <w:spacing w:after="0"/>
             </w:pPr>
@@ -3576,7 +3583,7 @@
             </w:tcMar>
             <w:vAlign w:val="center"/>
           </w:tcPr>
-          <w:p ns2:paraId="199EDCD0" ns2:textId="77777777">
+          <w:p>
             <w:pPr>
               <w:spacing w:after="0"/>
             </w:pPr>
@@ -3596,7 +3603,7 @@
             </w:tcMar>
             <w:vAlign w:val="center"/>
           </w:tcPr>
-          <w:p ns2:paraId="7E89DCCB" ns2:textId="77777777">
+          <w:p>
             <w:pPr>
               <w:spacing w:after="0"/>
             </w:pPr>
@@ -3616,7 +3623,7 @@
             </w:tcMar>
             <w:vAlign w:val="center"/>
           </w:tcPr>
-          <w:p ns2:paraId="09E851A8" ns2:textId="77777777">
+          <w:p>
             <w:pPr>
               <w:spacing w:after="0"/>
             </w:pPr>
@@ -3636,7 +3643,7 @@
             </w:tcMar>
             <w:vAlign w:val="center"/>
           </w:tcPr>
-          <w:p ns2:paraId="309161E4" ns2:textId="77777777">
+          <w:p>
             <w:pPr>
               <w:spacing w:after="0"/>
             </w:pPr>
@@ -3656,7 +3663,7 @@
             </w:tcMar>
             <w:vAlign w:val="center"/>
           </w:tcPr>
-          <w:p ns2:paraId="546522B9" ns2:textId="77777777">
+          <w:p>
             <w:pPr>
               <w:spacing w:after="0"/>
             </w:pPr>
@@ -3667,7 +3674,7 @@
         </w:tc>
       </w:tr>
     </w:tbl>
-    <w:p ns2:paraId="47CEC93C" ns2:textId="77777777">
+    <w:p>
       <w:pPr>
         <w:pStyle w:val="Heading1"/>
       </w:pPr>
@@ -3686,7 +3693,7 @@
         <w:gridCol w:w="5323"/>
         <w:gridCol w:w="5323"/>
       </w:tblGrid>
-      <w:tr ns2:paraId="0DD3D7A6" ns2:textId="77777777">
+      <w:tr>
         <w:trPr>
           <w:cantSplit/>
           <w:jc w:val="center"/>
@@ -3702,7 +3709,7 @@
               <w:right w:w="80" w:type="dxa"/>
             </w:tcMar>
           </w:tcPr>
-          <w:p ns2:paraId="630AEFF7" ns2:textId="77777777">
+          <w:p>
             <w:r>
               <w:rPr>
                 <w:b/>
@@ -3722,14 +3729,14 @@
               <w:right w:w="80" w:type="dxa"/>
             </w:tcMar>
           </w:tcPr>
-          <w:p ns2:paraId="35A4C986" ns2:textId="77777777">
+          <w:p>
             <w:r>
               <w:t>Senior QA &amp; Full-Stack Debugging Engineer (UAT Lead)</w:t>
             </w:r>
           </w:p>
         </w:tc>
       </w:tr>
-      <w:tr ns2:paraId="594B59C4" ns2:textId="77777777">
+      <w:tr>
         <w:trPr>
           <w:cantSplit/>
           <w:jc w:val="center"/>
@@ -3745,7 +3752,7 @@
               <w:right w:w="80" w:type="dxa"/>
             </w:tcMar>
           </w:tcPr>
-          <w:p ns2:paraId="1304B71A" ns2:textId="77777777">
+          <w:p>
             <w:r>
               <w:rPr>
                 <w:b/>
@@ -3765,14 +3772,14 @@
               <w:right w:w="80" w:type="dxa"/>
             </w:tcMar>
           </w:tcPr>
-          <w:p ns2:paraId="36F111F9" ns2:textId="77777777">
+          <w:p>
             <w:r>
               <w:t>27 October 2026</w:t>
             </w:r>
           </w:p>
         </w:tc>
       </w:tr>
-      <w:tr ns2:paraId="6153A6C6" ns2:textId="77777777">
+      <w:tr>
         <w:trPr>
           <w:cantSplit/>
           <w:jc w:val="center"/>
@@ -3788,7 +3795,7 @@
               <w:right w:w="80" w:type="dxa"/>
             </w:tcMar>
           </w:tcPr>
-          <w:p ns2:paraId="3ABFAC04" ns2:textId="77777777">
+          <w:p>
             <w:r>
               <w:rPr>
                 <w:b/>
@@ -3808,14 +3815,14 @@
               <w:right w:w="80" w:type="dxa"/>
             </w:tcMar>
           </w:tcPr>
-          <w:p ns2:paraId="6636D9F0" ns2:textId="77777777">
+          <w:p>
             <w:r>
               <w:t>Accepted — All 12 UAT Test Cases Passed (100% Defect Closure)</w:t>
             </w:r>
           </w:p>
         </w:tc>
       </w:tr>
-      <w:tr ns2:paraId="634513C3" ns2:textId="77777777">
+      <w:tr>
         <w:trPr>
           <w:cantSplit/>
           <w:jc w:val="center"/>
@@ -3831,12 +3838,13 @@
               <w:right w:w="80" w:type="dxa"/>
             </w:tcMar>
           </w:tcPr>
-          <w:p ns2:paraId="6131EAEB" ns2:textId="77777777">
+          <w:p>
             <w:r>
               <w:rPr>
                 <w:b/>
                 <w:sz w:val="17"/>
               </w:rPr>
+              <w:lastRenderedPageBreak/>
               <w:t>Outstanding Critical Defects</w:t>
             </w:r>
           </w:p>
@@ -3851,14 +3859,14 @@
               <w:right w:w="80" w:type="dxa"/>
             </w:tcMar>
           </w:tcPr>
-          <w:p ns2:paraId="530E3647" ns2:textId="77777777">
+          <w:p>
             <w:r>
               <w:t>0 (Zero Critical / High defects remaining open)</w:t>
             </w:r>
           </w:p>
         </w:tc>
       </w:tr>
-      <w:tr ns2:paraId="48567079" ns2:textId="77777777">
+      <w:tr>
         <w:trPr>
           <w:cantSplit/>
           <w:jc w:val="center"/>
@@ -3874,7 +3882,7 @@
               <w:right w:w="80" w:type="dxa"/>
             </w:tcMar>
           </w:tcPr>
-          <w:p ns2:paraId="6C14151A" ns2:textId="77777777">
+          <w:p>
             <w:r>
               <w:rPr>
                 <w:b/>
@@ -3894,7 +3902,7 @@
               <w:right w:w="80" w:type="dxa"/>
             </w:tcMar>
           </w:tcPr>
-          <w:p ns2:paraId="597A6A8C" ns2:textId="77777777">
+          <w:p>
             <w:r>
               <w:t>Verified &amp; Approved for Capstone Evaluation (MD AARIF IDRASI)</w:t>
             </w:r>
@@ -3902,7 +3910,7 @@
         </w:tc>
       </w:tr>
     </w:tbl>
-    <w:p ns2:paraId="3725B636" ns2:textId="77777777">
+    <w:p>
       <w:pPr>
         <w:pStyle w:val="Heading2"/>
       </w:pPr>
@@ -3910,7 +3918,7 @@
         <w:t>Notes &amp; Deployment Prerequisites</w:t>
       </w:r>
     </w:p>
-    <w:p ns2:paraId="3CCC10CE" ns2:textId="77777777">
+    <w:p>
       <w:pPr>
         <w:pStyle w:val="ListBullet"/>
         <w:spacing w:after="20"/>
@@ -3919,7 +3927,7 @@
         <w:t>Verify the configured MongoDB connection and environment variables before execution.</w:t>
       </w:r>
     </w:p>
-    <w:p ns2:paraId="7BAD8AD8" ns2:textId="77777777">
+    <w:p>
       <w:pPr>
         <w:pStyle w:val="ListBullet"/>
         <w:spacing w:after="20"/>
@@ -3928,7 +3936,7 @@
         <w:t>Use dedicated test accounts and sample records; do not use real personal or production data.</w:t>
       </w:r>
     </w:p>
-    <w:p ns2:paraId="4BB482C5" ns2:textId="77777777">
+    <w:p>
       <w:pPr>
         <w:pStyle w:val="ListBullet"/>
         <w:spacing w:after="20"/>
@@ -3937,7 +3945,7 @@
         <w:t>Record failed tests in the defect register, fix the issue, and rerun the affected test case.</w:t>
       </w:r>
     </w:p>
-    <w:p ns2:paraId="6709949C" ns2:textId="77777777">
+    <w:p>
       <w:pPr>
         <w:pStyle w:val="ListBullet"/>
         <w:spacing w:after="20"/>
@@ -3946,7 +3954,7 @@
         <w:t>Do not sign off or describe the application as production-ready until the required UAT has actually been completed and approved.</w:t>
       </w:r>
     </w:p>
-    <w:p ns2:paraId="759704BA" ns2:textId="77777777">
+    <w:p>
       <w:pPr>
         <w:pStyle w:val="ListBullet"/>
         <w:spacing w:after="20"/>
@@ -3955,7 +3963,7 @@
         <w:t>Optional services such as email delivery and Socket.IO real-time updates should be tested only if they have been implemented and configured.</w:t>
       </w:r>
     </w:p>
-    <w:p ns2:paraId="3D9D4E87" ns2:textId="77777777">
+    <w:p>
       <w:pPr>
         <w:pStyle w:val="Heading2"/>
       </w:pPr>
@@ -3963,7 +3971,7 @@
         <w:t>Acceptance Criteria</w:t>
       </w:r>
     </w:p>
-    <w:p ns2:paraId="56DA6DBA" ns2:textId="77777777">
+    <w:p>
       <w:r>
         <w:t>Acceptance should be granted only after the agreed critical test cases pass, access-control checks succeed, defects are reviewed, and the responsible reviewer records approval. This document is a test execution record and does not itself certify that the application has passed UAT.</w:t>
       </w:r>

</xml_diff>